<commit_message>
RackTrack July 17 update — full client, server, marketplace & docs
</commit_message>
<xml_diff>
--- a/DEMO_SCRIPT.docx
+++ b/DEMO_SCRIPT.docx
@@ -1239,6 +1239,81 @@
           <w:color w:val="1F6FB2"/>
           <w:sz w:val="30"/>
         </w:rPr>
+        <w:t>Cables — what's on the other end</w:t>
+      </w:r>
+    </w:p>
+    <w:p>
+      <w:r>
+        <w:rPr>
+          <w:b/>
+          <w:color w:val="8A4B00"/>
+        </w:rPr>
+        <w:t xml:space="preserve">👉 DO:  </w:t>
+      </w:r>
+      <w:r>
+        <w:t>On the Ports tab, switch to the Cables view.</w:t>
+      </w:r>
+    </w:p>
+    <w:p>
+      <w:r>
+        <w:rPr>
+          <w:b/>
+          <w:color w:val="0B5A2B"/>
+        </w:rPr>
+        <w:t xml:space="preserve">🗣  SAY:  </w:t>
+      </w:r>
+      <w:r>
+        <w:t>“Right beside the ports there's a Cables view, and it answers the question a technician actually asks: for every live port, what's on the other end of that cable? RackTrack reads it straight from the switch — the neighbor each port advertises, plus the switch's own address table — and turns it into a plain list: this port goes to this device.”</w:t>
+      </w:r>
+    </w:p>
+    <w:p>
+      <w:r>
+        <w:rPr>
+          <w:b/>
+          <w:color w:val="0B5A2B"/>
+        </w:rPr>
+        <w:t xml:space="preserve">🗣  SAY:  </w:t>
+      </w:r>
+      <w:r>
+        <w:t>“And it tells them apart. A port with a single device on it is a normal drop, so we show that device by name — a desktop, a laptop, a phone. But a port with twenty-something devices behind it isn't a desktop at all — it's the uplink to the rest of the network, and we label it exactly that. So in one glance you see every workstation and phone, and you see precisely which cable is the backbone. It's all live from the switch — no cable schedule to maintain, nothing typed by hand.”</w:t>
+      </w:r>
+    </w:p>
+    <w:p>
+      <w:r>
+        <w:rPr>
+          <w:b/>
+          <w:color w:val="606060"/>
+          <w:sz w:val="20"/>
+        </w:rPr>
+        <w:t xml:space="preserve">⚙  Behind the scenes:  </w:t>
+      </w:r>
+      <w:r>
+        <w:rPr>
+          <w:color w:val="606060"/>
+          <w:sz w:val="20"/>
+        </w:rPr>
+        <w:t>Cables = LLDP neighbors + the MAC address-table, read live over one SSH session. One MAC on a port → a named device; many MACs → an uplink/trunk. Logical layer only — passive patch panels have no chip, so they're honestly left out rather than guessed.</w:t>
+      </w:r>
+    </w:p>
+    <w:p/>
+    <w:p>
+      <w:pPr>
+        <w:spacing w:before="200" w:after="100"/>
+      </w:pPr>
+      <w:r>
+        <w:rPr>
+          <w:b/>
+          <w:color w:val="AAAAAA"/>
+          <w:sz w:val="22"/>
+        </w:rPr>
+        <w:t xml:space="preserve">STEP 16  </w:t>
+      </w:r>
+      <w:r>
+        <w:rPr>
+          <w:b/>
+          <w:color w:val="1F6FB2"/>
+          <w:sz w:val="30"/>
+        </w:rPr>
         <w:t>Drift — catching changes over time</w:t>
       </w:r>
     </w:p>
@@ -1310,7 +1385,7 @@
           <w:color w:val="AAAAAA"/>
           <w:sz w:val="22"/>
         </w:rPr>
-        <w:t xml:space="preserve">STEP 16  </w:t>
+        <w:t xml:space="preserve">STEP 17  </w:t>
       </w:r>
       <w:r>
         <w:rPr>
@@ -1389,7 +1464,7 @@
           <w:color w:val="AAAAAA"/>
           <w:sz w:val="22"/>
         </w:rPr>
-        <w:t xml:space="preserve">STEP 17  </w:t>
+        <w:t xml:space="preserve">STEP 18  </w:t>
       </w:r>
       <w:r>
         <w:rPr>
@@ -1430,7 +1505,7 @@
           <w:color w:val="AAAAAA"/>
           <w:sz w:val="22"/>
         </w:rPr>
-        <w:t xml:space="preserve">STEP 18  </w:t>
+        <w:t xml:space="preserve">STEP 19  </w:t>
       </w:r>
       <w:r>
         <w:rPr>
@@ -1509,7 +1584,7 @@
           <w:color w:val="AAAAAA"/>
           <w:sz w:val="22"/>
         </w:rPr>
-        <w:t xml:space="preserve">STEP 19  </w:t>
+        <w:t xml:space="preserve">STEP 20  </w:t>
       </w:r>
       <w:r>
         <w:rPr>
@@ -1550,7 +1625,7 @@
           <w:color w:val="AAAAAA"/>
           <w:sz w:val="22"/>
         </w:rPr>
-        <w:t xml:space="preserve">STEP 20  </w:t>
+        <w:t xml:space="preserve">STEP 21  </w:t>
       </w:r>
       <w:r>
         <w:rPr>
@@ -1606,7 +1681,7 @@
           <w:color w:val="AAAAAA"/>
           <w:sz w:val="22"/>
         </w:rPr>
-        <w:t xml:space="preserve">STEP 21  </w:t>
+        <w:t xml:space="preserve">STEP 22  </w:t>
       </w:r>
       <w:r>
         <w:rPr>
@@ -1670,7 +1745,7 @@
           <w:color w:val="AAAAAA"/>
           <w:sz w:val="22"/>
         </w:rPr>
-        <w:t xml:space="preserve">STEP 22  </w:t>
+        <w:t xml:space="preserve">STEP 23  </w:t>
       </w:r>
       <w:r>
         <w:rPr>
@@ -1726,7 +1801,7 @@
           <w:color w:val="AAAAAA"/>
           <w:sz w:val="22"/>
         </w:rPr>
-        <w:t xml:space="preserve">STEP 23  </w:t>
+        <w:t xml:space="preserve">STEP 24  </w:t>
       </w:r>
       <w:r>
         <w:rPr>
@@ -1805,7 +1880,7 @@
           <w:color w:val="AAAAAA"/>
           <w:sz w:val="22"/>
         </w:rPr>
-        <w:t xml:space="preserve">STEP 24  </w:t>
+        <w:t xml:space="preserve">STEP 25  </w:t>
       </w:r>
       <w:r>
         <w:rPr>

</xml_diff>